<commit_message>
feat: durcir sécurité admin/OAuth et nettoyer la dette technique
Valide modération/broadcast, gate OAuth guild, FileStore sessions, secrets CI, docs alignées, slash sync CLI-only et i18n Hub Discord FR/EN.

Co-authored-by: Cursor <cursoragent@cursor.com>
</commit_message>
<xml_diff>
--- a/DOCUMENTATION_FONCTIONNALITES_PEAXEL.docx
+++ b/DOCUMENTATION_FONCTIONNALITES_PEAXEL.docx
@@ -121,7 +121,7 @@
         <w:spacing w:after="60"/>
       </w:pPr>
       <w:r>
-        <w:t xml:space="preserve">Leaderboard XP de la gameweek + podium top 3 lundi</w:t>
+        <w:t xml:space="preserve">Leaderboard XP de la gameweek + podium #1 dimanche soir</w:t>
       </w:r>
     </w:p>
     <w:p>
@@ -348,7 +348,7 @@
         <w:tc>
           <w:p>
             <w:r>
-              <w:t xml:space="preserve">Podium + défis</w:t>
+              <w:t xml:space="preserve">Défis hebdo</w:t>
             </w:r>
           </w:p>
         </w:tc>
@@ -362,7 +362,30 @@
         <w:tc>
           <w:p>
             <w:r>
-              <w:t xml:space="preserve">Récompense top 3 XP de la GW précédente + génération des 3 défis de la nouvelle semaine.</w:t>
+              <w:t xml:space="preserve">Génération des 3 missions de la nouvelle semaine.</w:t>
+            </w:r>
+          </w:p>
+        </w:tc>
+      </w:tr>
+      <w:tr>
+        <w:tc>
+          <w:p>
+            <w:r>
+              <w:t xml:space="preserve">Podium #1</w:t>
+            </w:r>
+          </w:p>
+        </w:tc>
+        <w:tc>
+          <w:p>
+            <w:r>
+              <w:t xml:space="preserve">Dimanche 20:05</w:t>
+            </w:r>
+          </w:p>
+        </w:tc>
+        <w:tc>
+          <w:p>
+            <w:r>
+              <w:t xml:space="preserve">Récompense #1 XP de la GW précédente (+150 XP + carte common) + annonce Discord.</w:t>
             </w:r>
           </w:p>
         </w:tc>
@@ -694,7 +717,7 @@
         <w:tc>
           <w:p>
             <w:r>
-              <w:t xml:space="preserve">+200 XP + carte rare</w:t>
+              <w:t xml:space="preserve">+200 XP + carte common</w:t>
             </w:r>
           </w:p>
         </w:tc>
@@ -710,7 +733,7 @@
         <w:tc>
           <w:p>
             <w:r>
-              <w:t xml:space="preserve">+500 XP + carte epic</w:t>
+              <w:t xml:space="preserve">+500 XP + carte common</w:t>
             </w:r>
           </w:p>
         </w:tc>
@@ -815,14 +838,14 @@
         <w:tc>
           <w:p>
             <w:r>
-              <w:t xml:space="preserve">Podium #1 / #2 / #3</w:t>
-            </w:r>
-          </w:p>
-        </w:tc>
-        <w:tc>
-          <w:p>
-            <w:r>
-              <w:t xml:space="preserve">+150 epic / +100 rare / +50 common</w:t>
+              <w:t xml:space="preserve">Podium #1 (dimanche 20:05)</w:t>
+            </w:r>
+          </w:p>
+        </w:tc>
+        <w:tc>
+          <w:p>
+            <w:r>
+              <w:t xml:space="preserve">+150 XP + carte common</w:t>
             </w:r>
           </w:p>
         </w:tc>
@@ -838,7 +861,7 @@
         <w:tc>
           <w:p>
             <w:r>
-              <w:t xml:space="preserve">Carte pending (tier selon niveau : common &lt;5, rare ≥5, epic ≥10)</w:t>
+              <w:t xml:space="preserve">Pas de carte (progression niveau uniquement)</w:t>
             </w:r>
           </w:p>
         </w:tc>
@@ -1134,7 +1157,7 @@
         <w:spacing w:after="60"/>
       </w:pPr>
       <w:r>
-        <w:t xml:space="preserve">Lundi 00:05 : settle podium top 3 de la GW précédente + annonce Discord branded</w:t>
+        <w:t xml:space="preserve">Dimanche 20:05 : settle podium #1 de la GW précédente + annonce Discord branded</w:t>
       </w:r>
     </w:p>
     <w:p>
@@ -1148,6 +1171,19 @@
       </w:pPr>
       <w:r>
         <w:t xml:space="preserve">Anti-doublon podium par utilisateur / semaine</w:t>
+      </w:r>
+    </w:p>
+    <w:p>
+      <w:pPr>
+        <w:pStyle w:val="ListParagraph"/>
+        <w:numPr>
+          <w:ilvl w:val="0"/>
+          <w:numId w:val="1"/>
+        </w:numPr>
+        <w:spacing w:after="60"/>
+      </w:pPr>
+      <w:r>
+        <w:t xml:space="preserve">/rank affiche un aperçu top 3 (lecture seule) — seule la place #1 est récompensée</w:t>
       </w:r>
     </w:p>
     <w:p>
@@ -1173,7 +1209,7 @@
         <w:spacing w:after="60"/>
       </w:pPr>
       <w:r>
-        <w:t xml:space="preserve">Cartes pending : quête, level-up, streak, podium, quiz win</w:t>
+        <w:t xml:space="preserve">Cartes pending : quête, streak, podium #1, quiz win (pas de carte au level-up)</w:t>
       </w:r>
     </w:p>
     <w:p>
@@ -3039,7 +3075,7 @@
         <w:spacing w:after="120"/>
       </w:pPr>
       <w:r>
-        <w:t xml:space="preserve">Compétition → leaderboard GW + podium lundi</w:t>
+        <w:t xml:space="preserve">Compétition → leaderboard GW + podium #1 dimanche</w:t>
       </w:r>
     </w:p>
     <w:p>

</xml_diff>

<commit_message>
feat: classements Hub publics et retrait backlog feedback/quiz v2
Ajoute /app/leaderboard (semaine + général) avec fiches manager, et retire Feedback saisonnier/NPS + Scout Quiz indices/saison du ROADMAP et docs.

Co-authored-by: Cursor <cursoragent@cursor.com>
</commit_message>
<xml_diff>
--- a/DOCUMENTATION_FONCTIONNALITES_PEAXEL.docx
+++ b/DOCUMENTATION_FONCTIONNALITES_PEAXEL.docx
@@ -1373,7 +1373,7 @@
         <w:spacing w:after="60"/>
       </w:pPr>
       <w:r>
-        <w:t xml:space="preserve">1 feedback à vie par utilisateur (v2 saisonnier prévu en roadmap)</w:t>
+        <w:t xml:space="preserve">1 feedback à vie par utilisateur</w:t>
       </w:r>
     </w:p>
     <w:p>
@@ -3131,19 +3131,6 @@
       </w:pPr>
       <w:r>
         <w:t xml:space="preserve">GW Check-in lineup (bouton opening + XP)</w:t>
-      </w:r>
-    </w:p>
-    <w:p>
-      <w:pPr>
-        <w:pStyle w:val="ListParagraph"/>
-        <w:numPr>
-          <w:ilvl w:val="0"/>
-          <w:numId w:val="1"/>
-        </w:numPr>
-        <w:spacing w:after="60"/>
-      </w:pPr>
-      <w:r>
-        <w:t xml:space="preserve">Feedback par saison / vrai NPS</w:t>
       </w:r>
     </w:p>
     <w:p>

</xml_diff>